<commit_message>
pilot: progressive wall-time tracking (baseline->op-by-op E2E dummy-weight ledger, cosine-fingerprint integration gate) + MoE anti-mode-collapse verified input; playbook updated
</commit_message>
<xml_diff>
--- a/docs/dsv4_pilot_playbook.docx
+++ b/docs/dsv4_pilot_playbook.docx
@@ -397,6 +397,187 @@
     </w:p>
     <w:p>
       <w:pPr>
+        <w:pStyle w:val="Heading1"/>
+      </w:pPr>
+      <w:r>
+        <w:rPr>
+          <w:color w:val="1F3764"/>
+          <w:sz w:val="30"/>
+        </w:rPr>
+        <w:t>Progressive wall-time tracking (publication ledger)</w:t>
+      </w:r>
+    </w:p>
+    <w:p>
+      <w:pPr>
+        <w:spacing w:after="80"/>
+      </w:pPr>
+      <w:r>
+        <w:rPr>
+          <w:b/>
+          <w:sz w:val="21"/>
+        </w:rPr>
+        <w:t>Each optimization is proven end-to-end, not just in a microbench. We keep a running wall-time ledger from the unoptimized baseline through every integrated op, so the final publication shows a monotonic, correctness-gated speed-up curve.</w:t>
+      </w:r>
+    </w:p>
+    <w:p>
+      <w:pPr>
+        <w:spacing w:after="80"/>
+      </w:pPr>
+      <w:r>
+        <w:rPr>
+          <w:b w:val="0"/>
+          <w:color w:val="555555"/>
+          <w:sz w:val="21"/>
+        </w:rPr>
+        <w:t>Ledger artifact: plugin/validate/results/wall_time_progress.json (baseline row + one row per op, filled after each integration).</w:t>
+      </w:r>
+    </w:p>
+    <w:p>
+      <w:pPr>
+        <w:pStyle w:val="Heading2"/>
+      </w:pPr>
+      <w:r>
+        <w:rPr>
+          <w:color w:val="2E5BA8"/>
+          <w:sz w:val="24"/>
+        </w:rPr>
+        <w:t>The loop (repeat per op, in Phase-A order)</w:t>
+      </w:r>
+    </w:p>
+    <w:p>
+      <w:pPr>
+        <w:pStyle w:val="ListNumber"/>
+        <w:spacing w:after="40"/>
+      </w:pPr>
+      <w:r>
+        <w:rPr>
+          <w:b/>
+          <w:color w:val="1F3764"/>
+        </w:rPr>
+        <w:t xml:space="preserve">0 — </w:t>
+      </w:r>
+      <w:r>
+        <w:t>Baseline wall time FIRST: run the full model end-to-end with deterministic-dummy weights and record the steady-state median latency at each M (step 0 = the reference; never time the cold step).</w:t>
+      </w:r>
+    </w:p>
+    <w:p>
+      <w:pPr>
+        <w:pStyle w:val="ListNumber"/>
+        <w:spacing w:after="40"/>
+      </w:pPr>
+      <w:r>
+        <w:rPr>
+          <w:b/>
+          <w:color w:val="1F3764"/>
+        </w:rPr>
+        <w:t xml:space="preserve">1 — </w:t>
+      </w:r>
+      <w:r>
+        <w:t>Optimize the op standalone to its machine-peak ceiling (author → measure → iterate → keep best-of), then surface-and-stop when levers are exhausted.</w:t>
+      </w:r>
+    </w:p>
+    <w:p>
+      <w:pPr>
+        <w:pStyle w:val="ListNumber"/>
+        <w:spacing w:after="40"/>
+      </w:pPr>
+      <w:r>
+        <w:rPr>
+          <w:b/>
+          <w:color w:val="1F3764"/>
+        </w:rPr>
+        <w:t xml:space="preserve">2 — </w:t>
+      </w:r>
+      <w:r>
+        <w:t>Integrate the kept kernel into the model behind a COSINE FINGERPRINT gate: per-layer + per-op cosine vs the torch/GPU reference on the SAME dummy weights must stay ≥ 0.9999 (set-match for top-k ops). The first layer/op below threshold localizes a break — do not proceed until it passes.</w:t>
+      </w:r>
+    </w:p>
+    <w:p>
+      <w:pPr>
+        <w:pStyle w:val="ListNumber"/>
+        <w:spacing w:after="40"/>
+      </w:pPr>
+      <w:r>
+        <w:rPr>
+          <w:b/>
+          <w:color w:val="1F3764"/>
+        </w:rPr>
+        <w:t xml:space="preserve">3 — </w:t>
+      </w:r>
+      <w:r>
+        <w:t>Re-run the model end-to-end (dummy weights, same M sweep) and record the new wall time + the delta vs the previous row and the cumulative speed-up vs baseline.</w:t>
+      </w:r>
+    </w:p>
+    <w:p>
+      <w:pPr>
+        <w:pStyle w:val="ListNumber"/>
+        <w:spacing w:after="40"/>
+      </w:pPr>
+      <w:r>
+        <w:rPr>
+          <w:b/>
+          <w:color w:val="1F3764"/>
+        </w:rPr>
+        <w:t xml:space="preserve">4 — </w:t>
+      </w:r>
+      <w:r>
+        <w:t>Repeat for the next op. The ledger accumulates to the final published curve: baseline → op-by-op → fully-optimized.</w:t>
+      </w:r>
+    </w:p>
+    <w:p>
+      <w:pPr>
+        <w:pStyle w:val="Heading2"/>
+      </w:pPr>
+      <w:r>
+        <w:rPr>
+          <w:color w:val="2E5BA8"/>
+          <w:sz w:val="24"/>
+        </w:rPr>
+        <w:t>MoE mode-collapse — the input tensor matters</w:t>
+      </w:r>
+    </w:p>
+    <w:p>
+      <w:pPr>
+        <w:spacing w:after="80"/>
+      </w:pPr>
+      <w:r>
+        <w:rPr>
+          <w:b w:val="0"/>
+          <w:color w:val="555555"/>
+          <w:sz w:val="21"/>
+        </w:rPr>
+        <w:t>The dummy-weight run must exercise a REPRESENTATIVE set of routed experts. With tiny random gate weights, a non-diverse input (e.g. one hidden vector broadcast across the batch) collapses routing to the same top-k experts every token — only ~topk of the E=256 experts run, so the measured MoE wall time is unrepresentatively low and the roofline's expert traffic is never incurred.</w:t>
+      </w:r>
+    </w:p>
+    <w:p>
+      <w:pPr>
+        <w:pStyle w:val="ListBullet"/>
+        <w:spacing w:after="40"/>
+      </w:pPr>
+      <w:r>
+        <w:t>Build the input with plugin/validate/moe_balanced_input.build_verified_input(M, gate_weight): per-token i.i.d. hidden states (NOT a broadcast), falling back to round-robin gate-row alignment.</w:t>
+      </w:r>
+    </w:p>
+    <w:p>
+      <w:pPr>
+        <w:pStyle w:val="ListBullet"/>
+        <w:spacing w:after="40"/>
+      </w:pPr>
+      <w:r>
+        <w:t>VERIFY (not assume) dispersion: realized distinct-experts must track the uniform expectation E·(1−(1−1/E)^(topk·M)) and no expert may absorb an outsized share — a collapse gate asserts this before the timing is trusted. (Checked M=8→43, 16→81, 32→138, 64→209 distinct vs expected 43.8/80.2/135.3/199; the broadcast trap collapses to 6 and is rejected.)</w:t>
+      </w:r>
+    </w:p>
+    <w:p>
+      <w:pPr>
+        <w:pStyle w:val="ListBullet"/>
+        <w:spacing w:after="40"/>
+      </w:pPr>
+      <w:r>
+        <w:t>Instrument the real router during the E2E run to confirm the same spread in-engine (per-forward distinct-expert count), so the proxy input is validated against the actual model path.</w:t>
+      </w:r>
+    </w:p>
+    <w:p>
+      <w:pPr>
         <w:pStyle w:val="Heading2"/>
       </w:pPr>
       <w:r>
@@ -698,7 +879,7 @@
           </w:tcPr>
           <w:p>
             <w:r>
-              <w:t>Memory BW</w:t>
+              <w:t>Memory BW (roofline ceiling)</w:t>
             </w:r>
           </w:p>
         </w:tc>
@@ -708,7 +889,7 @@
           </w:tcPr>
           <w:p>
             <w:r>
-              <w:t>214.4 GB/s per domain (stream-triad)</w:t>
+              <w:t>358.4 GB/s machine peak (8ch × DDR5-5600 × 8B); measured floor 214.4 GB/s = 60% of peak</w:t>
             </w:r>
           </w:p>
         </w:tc>
@@ -720,7 +901,7 @@
           </w:tcPr>
           <w:p>
             <w:r>
-              <w:t>AMX bf16 peak</w:t>
+              <w:t>AMX bf16 (roofline ceiling)</w:t>
             </w:r>
           </w:p>
         </w:tc>
@@ -730,7 +911,7 @@
           </w:tcPr>
           <w:p>
             <w:r>
-              <w:t>40.3 TFLOP/s (torch.matmul plateau @16384³; ~32% of theoretical; conservative)</w:t>
+              <w:t>124.6 TFLOP/s machine peak (64c × 1024 FLOP/cyc × 1.9 GHz base); measured floor 40.3 TFLOP/s = 32% of peak</w:t>
             </w:r>
           </w:p>
         </w:tc>
@@ -752,7 +933,29 @@
           </w:tcPr>
           <w:p>
             <w:r>
-              <w:t>~188 FLOP/byte</w:t>
+              <w:t>~348 FLOP/byte (machine peak)</w:t>
+            </w:r>
+          </w:p>
+        </w:tc>
+      </w:tr>
+      <w:tr>
+        <w:tc>
+          <w:tcPr>
+            <w:tcW w:type="dxa" w:w="4320"/>
+          </w:tcPr>
+          <w:p>
+            <w:r>
+              <w:t>Optimization basis</w:t>
+            </w:r>
+          </w:p>
+        </w:tc>
+        <w:tc>
+          <w:tcPr>
+            <w:tcW w:type="dxa" w:w="4320"/>
+          </w:tcPr>
+          <w:p>
+            <w:r>
+              <w:t>Optimize every op toward MACHINE PEAK; when levers are exhausted and it plateaus below peak, surface the residual gap and stop that op</w:t>
             </w:r>
           </w:p>
         </w:tc>

</xml_diff>

<commit_message>
pilot: dual-record proxy+full-scaled wall time; add Phase-B framework/dispatch/OMP overhead step on integrated proxy (surface before full-depth run); encode depth-scaling + overhead learnings in playbook
</commit_message>
<xml_diff>
--- a/docs/dsv4_pilot_playbook.docx
+++ b/docs/dsv4_pilot_playbook.docx
@@ -522,6 +522,153 @@
       </w:r>
       <w:r>
         <w:t>Repeat for the next op. The ledger accumulates to the final published curve: baseline → op-by-op → fully-optimized.</w:t>
+      </w:r>
+    </w:p>
+    <w:p>
+      <w:pPr>
+        <w:pStyle w:val="Heading2"/>
+      </w:pPr>
+      <w:r>
+        <w:rPr>
+          <w:color w:val="2E5BA8"/>
+          <w:sz w:val="24"/>
+        </w:rPr>
+        <w:t>Depth-proxy timing + analytical scaling to full depth</w:t>
+      </w:r>
+    </w:p>
+    <w:p>
+      <w:pPr>
+        <w:spacing w:after="80"/>
+      </w:pPr>
+      <w:r>
+        <w:rPr>
+          <w:b w:val="0"/>
+          <w:color w:val="555555"/>
+          <w:sz w:val="21"/>
+        </w:rPr>
+        <w:t>Perf runs use DUMMY weights (no real load) AND a depth-reduced proxy: every DSv4 layer is the identical MoE+MLA+DSA archetype (first_k_dense_replace=0, moe_layer_freq=1), so end-to-end wall time is LINEAR in depth, t(L) = t_fixed + L·t_layer. This keeps every iteration cheap (4 layers, not 43) while still reporting a full-depth number.</w:t>
+      </w:r>
+    </w:p>
+    <w:p>
+      <w:pPr>
+        <w:pStyle w:val="ListBullet"/>
+        <w:spacing w:after="40"/>
+      </w:pPr>
+      <w:r>
+        <w:t>Calibrate ONCE at baseline from two proxy depths (4 and 8 layers): t_layer = (t₈ − t₄)/4 and t_fixed = t₄ − 4·t_layer, where t_fixed is the non-layer cost (embed + lm_head + framework/sampling).</w:t>
+      </w:r>
+    </w:p>
+    <w:p>
+      <w:pPr>
+        <w:pStyle w:val="ListBullet"/>
+        <w:spacing w:after="40"/>
+      </w:pPr>
+      <w:r>
+        <w:t>Each iteration records BOTH: (a) the MEASURED proxy-4 wall time, and (b) the full-depth wall time derived ANALYTICALLY — t_layer(iter) = (t_proxy4(iter) − t_fixed)/4, predicted full = t_fixed + 43·t_layer(iter). Report proxy and full-scaled speed-up curves side by side (they differ because the fixed overhead does not scale).</w:t>
+      </w:r>
+    </w:p>
+    <w:p>
+      <w:pPr>
+        <w:pStyle w:val="ListBullet"/>
+        <w:spacing w:after="40"/>
+      </w:pPr>
+      <w:r>
+        <w:t>t_fixed is config-invariant across per-layer optimizations; recalibrate only if a NON-layer op (e.g. lm_head) is optimized.</w:t>
+      </w:r>
+    </w:p>
+    <w:p>
+      <w:pPr>
+        <w:pStyle w:val="ListBullet"/>
+        <w:spacing w:after="40"/>
+      </w:pPr>
+      <w:r>
+        <w:t>END VALIDATION: after all ops are integrated, do ONE full-depth dummy run (43 layers) and compare the MEASURED full-depth wall time against the analytically predicted value — small error confirms the whole depth-scaled progression. Ledger: plugin/validate/results/wall_time_progress.json.</w:t>
+      </w:r>
+    </w:p>
+    <w:p>
+      <w:pPr>
+        <w:pStyle w:val="Heading2"/>
+      </w:pPr>
+      <w:r>
+        <w:rPr>
+          <w:color w:val="2E5BA8"/>
+          <w:sz w:val="24"/>
+        </w:rPr>
+        <w:t>Framework / dispatch / OpenMP overhead — the proxy studies these too (Phase B on the proxy)</w:t>
+      </w:r>
+    </w:p>
+    <w:p>
+      <w:pPr>
+        <w:spacing w:after="80"/>
+      </w:pPr>
+      <w:r>
+        <w:rPr>
+          <w:b w:val="0"/>
+          <w:color w:val="555555"/>
+          <w:sz w:val="21"/>
+        </w:rPr>
+        <w:t>The depth proxy is the right instrument for system overhead, not just op math: the depth-independent t_fixed term IS the framework/dispatch/sampling cost, and per-op dispatch + OpenMP-barrier overhead lives in t_layer and is incurred every layer — both are fully present at depth 4. Global OMP pathologies are depth-invariant, so the proxy reproduces them at a fraction of the cost.</w:t>
+      </w:r>
+    </w:p>
+    <w:p>
+      <w:pPr>
+        <w:pStyle w:val="ListNumber"/>
+        <w:spacing w:after="40"/>
+      </w:pPr>
+      <w:r>
+        <w:rPr>
+          <w:b/>
+          <w:color w:val="1F3764"/>
+        </w:rPr>
+        <w:t xml:space="preserve">Order — </w:t>
+      </w:r>
+      <w:r>
+        <w:t>Finish ALL ops/fused-ops to their roofline ceiling and integrate them into the proxy (end of Phase A); record the fully-integrated proxy + full-scaled wall time.</w:t>
+      </w:r>
+    </w:p>
+    <w:p>
+      <w:pPr>
+        <w:pStyle w:val="ListNumber"/>
+        <w:spacing w:after="40"/>
+      </w:pPr>
+      <w:r>
+        <w:t>THEN attack framework/dispatch/OMP overhead on that integrated proxy (this is Phase B). Bit-exact gate: an overhead fix must not change tokens.</w:t>
+      </w:r>
+    </w:p>
+    <w:p>
+      <w:pPr>
+        <w:pStyle w:val="ListNumber"/>
+        <w:spacing w:after="40"/>
+      </w:pPr>
+      <w:r>
+        <w:t>Show the wall-time improvement from the overhead work (proxy + full-scaled), SURFACE it, and only THEN launch the single full-depth run.</w:t>
+      </w:r>
+    </w:p>
+    <w:p>
+      <w:pPr>
+        <w:pStyle w:val="ListBullet"/>
+        <w:spacing w:after="40"/>
+      </w:pPr>
+      <w:r>
+        <w:t>Bind threads ONCE at init — never per-forward torch.set_num_threads (it rebuilds the OpenMP pool and LOSES CPU affinity → unpinned contention inflates the whole forward uniformly; invisible per-op).</w:t>
+      </w:r>
+    </w:p>
+    <w:p>
+      <w:pPr>
+        <w:pStyle w:val="ListBullet"/>
+        <w:spacing w:after="40"/>
+      </w:pPr>
+      <w:r>
+        <w:t>Collapse many tiny torch ops into fewer/bigger parallel regions — at N threads each tiny op pays a barrier, so ~100 ops/layer is a ~10-20x dispatch tax; fuse into one parallel region.</w:t>
+      </w:r>
+    </w:p>
+    <w:p>
+      <w:pPr>
+        <w:pStyle w:val="ListBullet"/>
+        <w:spacing w:after="40"/>
+      </w:pPr>
+      <w:r>
+        <w:t>Clear the usual systemic levers: OMP spin-wait (OMP_WAIT_POLICY), allocator (tcmalloc/jemalloc), NUMA first-touch into the rank's own domain, thread-cap, CPU-freq/cold-start; remove dtype-cast and dispatch churn on the hot path. A global-config pathology masquerades as uniform per-op cost — clear it before trusting any per-op ranking.</w:t>
       </w:r>
     </w:p>
     <w:p>

</xml_diff>

<commit_message>
playbook: make model- & platform-agnostic + self-contained (drop old-scheme skill/tree refs; EMR/DSv4 relabeled as example instantiation; CPU+GPU language); clean roofline docstring
</commit_message>
<xml_diff>
--- a/docs/dsv4_pilot_playbook.docx
+++ b/docs/dsv4_pilot_playbook.docx
@@ -12,7 +12,7 @@
           <w:color w:val="1F3764"/>
           <w:sz w:val="40"/>
         </w:rPr>
-        <w:t>CPU Model Enablement + Optimization Playbook</w:t>
+        <w:t>Model- &amp; Platform-Agnostic Enablement + Optimization Playbook</w:t>
       </w:r>
     </w:p>
     <w:p>
@@ -24,7 +24,7 @@
           <w:color w:val="555555"/>
           <w:sz w:val="24"/>
         </w:rPr>
-        <w:t>Scale-stratified methodology — DeepSeek-V4-Flash tree pilot (EMR)</w:t>
+        <w:t>A reusable methodology for enabling AND optimizing any model on any accelerator (CPU shown; the same loop applies to other CPUs and to GPUs)</w:t>
       </w:r>
     </w:p>
     <w:p>
@@ -36,7 +36,7 @@
           <w:color w:val="555555"/>
           <w:sz w:val="18"/>
         </w:rPr>
-        <w:t>Reference build — 2026-10-07</w:t>
+        <w:t>Platform and model constants are INPUTS, not assumptions. The concrete pilot instantiation (DeepSeek-V4-Flash on Intel Xeon / EMR) lives in the per-platform spec + roofline artifacts, not in this method.</w:t>
       </w:r>
     </w:p>
     <w:p>
@@ -61,7 +61,7 @@
           <w:color w:val="555555"/>
           <w:sz w:val="21"/>
         </w:rPr>
-        <w:t>Goal: from a bare model config + checkpoint, run CPU enablement AND optimization end-to-end for any model, with final wall-time driven toward the sum of kernel roofline times — framework overhead squeezed out and every kept kernel at its ceiling.</w:t>
+        <w:t>Goal: from a bare model config + checkpoint, enable AND optimize the model end-to-end on a target accelerator, driving final wall-time toward the sum of the per-op roofline floors — platform/runtime overhead squeezed out and every kept kernel at its ceiling. Nothing here is specific to one model or one chip: the platform constants, the op set, and the native-kernel library are INPUTS.</w:t>
       </w:r>
     </w:p>
     <w:p>
@@ -73,7 +73,7 @@
           <w:b/>
           <w:sz w:val="21"/>
         </w:rPr>
-        <w:t>Two theses, one plugin (SGLang external model package, override by __name__, no fork):</w:t>
+        <w:t>Two theses, one plugin (wire into the serving stack via its external/plugin mechanism — no fork):</w:t>
       </w:r>
     </w:p>
     <w:p>
@@ -86,10 +86,10 @@
           <w:b/>
           <w:color w:val="1F3764"/>
         </w:rPr>
-        <w:t xml:space="preserve">Thesis 1 — </w:t>
+        <w:t xml:space="preserve">Thesis 1 (covered) — </w:t>
       </w:r>
       <w:r>
-        <w:t>models whose ops are fully covered by existing AMX/CPU kernels are enabled by wiring + validation only (capability inheritance: bf16/int8, AMX, prepack/VNNI, FusedMoE).</w:t>
+        <w:t>ops already covered by the target's native high-throughput kernels (e.g. AMX/oneDNN on CPU, Tensor-Core/cuBLAS/Triton on GPU) are enabled by wiring + validation only (capability inheritance: dtype, prepack/layout, fused-MoE).</w:t>
       </w:r>
     </w:p>
     <w:p>
@@ -102,10 +102,10 @@
           <w:b/>
           <w:color w:val="1F3764"/>
         </w:rPr>
-        <w:t xml:space="preserve">Thesis 2 — </w:t>
+        <w:t xml:space="preserve">Thesis 2 (novel) — </w:t>
       </w:r>
       <w:r>
-        <w:t>genuinely novel ops get an AI-written, roofline-tuned C/C++ kernel, human-gated.</w:t>
+        <w:t>genuinely novel ops get an AI-written, roofline-tuned native kernel (C/C++ for CPU, CUDA/Triton for GPU), human-gated.</w:t>
       </w:r>
     </w:p>
     <w:p>
@@ -118,7 +118,7 @@
           <w:color w:val="555555"/>
           <w:sz w:val="21"/>
         </w:rPr>
-        <w:t>Scope-discovery (coverage-gate) is the router; the spine-leaf performance tree (macro/meso/micro roofline loop) is the engine. One pipeline.</w:t>
+        <w:t>Scope discovery is the router (which ops are covered vs novel); the per-op roofline loop is the engine. One pipeline, re-applied per (model, platform).</w:t>
       </w:r>
     </w:p>
     <w:p>
@@ -190,7 +190,7 @@
         <w:spacing w:after="40"/>
       </w:pPr>
       <w:r>
-        <w:t>Implement the op in C/C++ and optimize to a reasonable extent, driving it to its ceiling (BW peak / compute peak / latency floor).</w:t>
+        <w:t>Implement the op in the target's native kernel language (C/C++ on CPU, CUDA/Triton on GPU) and optimize to a reasonable extent, driving it to its ceiling (BW peak / compute peak / latency floor).</w:t>
       </w:r>
     </w:p>
     <w:p>
@@ -229,7 +229,7 @@
         <w:spacing w:after="40"/>
       </w:pPr>
       <w:r>
-        <w:t>Switch to wall-time; fix system pathology first (OpenMP spin-wait, thread-cap, NUMA bind, allocator, dispatch, batching) until kernel-domination clears the bar.</w:t>
+        <w:t>Switch to wall-time; fix platform/runtime pathology first (CPU: OpenMP spin-wait/affinity, NUMA bind, allocator; GPU: launch/stream config, occupancy, memory pool; plus dispatch &amp; batching) until kernel-domination clears the bar.</w:t>
       </w:r>
     </w:p>
     <w:p>
@@ -284,7 +284,7 @@
         <w:spacing w:after="40"/>
       </w:pPr>
       <w:r>
-        <w:t>Run the uArch probe on the target node → measured machine_constants: per-NUMA-domain memory BW, per-dtype compute peak, ridge = peak/BW, NUMA/SNC, ISA. No hardcoded constants.</w:t>
+        <w:t>Run the uArch probe on the target device → measured machine constants: per-memory-domain BW, per-dtype compute peak, ridge = peak/BW, topology (CPU: NUMA/SNC; GPU: devices/interconnect), ISA/occupancy. No hardcoded constants — swap the spec file to retarget.</w:t>
       </w:r>
     </w:p>
     <w:p>
@@ -293,7 +293,7 @@
         <w:spacing w:after="40"/>
       </w:pPr>
       <w:r>
-        <w:t>Data-type audit from the real checkpoint (metadata-only first): {op, stored dtype, target compute dtype, kernel, inflation?, dtype-bridge, parity gate}. Never inflate a native low-bit checkpoint; sub-tile dtypes are moved low-bit and computed bf16 via fused dequant.</w:t>
+        <w:t>Data-type audit from the real checkpoint (metadata-only first): {op, stored dtype, target compute dtype, kernel, inflation?, dtype-bridge, parity gate}. Never inflate a native low-bit checkpoint; sub-tile dtypes are moved low-bit and computed in the native compute dtype via fused dequant.</w:t>
       </w:r>
     </w:p>
     <w:p>
@@ -302,7 +302,7 @@
         <w:spacing w:after="40"/>
       </w:pPr>
       <w:r>
-        <w:t>Capacity pre-flight: resident weights + activations + KV/state vs per-domain RAM floor → tp/EP (EP-first for MoE; CPU tp&gt;1 hurts latency-bound decode).</w:t>
+        <w:t>Capacity pre-flight: resident weights + activations + KV/state vs per-domain memory floor → parallelism map (tp/EP; EP-first for MoE). On CPU tp&gt;1 hurts latency-bound decode; on GPU pick tp/EP by memory fit + interconnect.</w:t>
       </w:r>
     </w:p>
     <w:p>
@@ -341,7 +341,7 @@
         <w:spacing w:after="40"/>
       </w:pPr>
       <w:r>
-        <w:t>Coverage-gate assigns each op a lane: A = covered on CPU (donor); B = missing on CPU but GPU/XPU reference exists (oracle); C = missing, author from math spec.</w:t>
+        <w:t>Scope discovery assigns each op a lane: A = covered by a native kernel on the target (donor); B = missing on the target but a reference impl exists elsewhere (numerical oracle); C = missing, author from the math spec.</w:t>
       </w:r>
     </w:p>
     <w:p>
@@ -380,7 +380,7 @@
         <w:spacing w:after="40"/>
       </w:pPr>
       <w:r>
-        <w:t>Per-op and per-fused-op roofline: FLOPs, weight+activation+KV bytes, arithmetic intensity, binding resource, achievable ceiling, and the C/C++ implementation lane. Phase-split prefill vs decode.</w:t>
+        <w:t>Per-op and per-fused-op roofline: FLOPs, weight+activation+KV bytes, arithmetic intensity, binding resource, achievable ceiling, and the native-kernel implementation lane. Phase-split prefill vs decode.</w:t>
       </w:r>
     </w:p>
     <w:p>
@@ -457,7 +457,7 @@
         <w:t xml:space="preserve">0 — </w:t>
       </w:r>
       <w:r>
-        <w:t>Baseline wall time FIRST: run the full model end-to-end with deterministic-dummy weights and record the steady-state median latency at each M (step 0 = the reference; never time the cold step).</w:t>
+        <w:t>Baseline wall time FIRST: run the model end-to-end (depth proxy, deterministic-dummy weights) and record the steady-state median latency at each M (step 0 = the reference; never time the cold step).</w:t>
       </w:r>
     </w:p>
     <w:p>
@@ -489,7 +489,7 @@
         <w:t xml:space="preserve">2 — </w:t>
       </w:r>
       <w:r>
-        <w:t>Integrate the kept kernel into the model behind a COSINE FINGERPRINT gate: per-layer + per-op cosine vs the torch/GPU reference on the SAME dummy weights must stay ≥ 0.9999 (set-match for top-k ops). The first layer/op below threshold localizes a break — do not proceed until it passes.</w:t>
+        <w:t>Integrate the kept kernel into the model behind a COSINE FINGERPRINT gate: per-layer + per-op cosine vs a trusted reference (eager / GPU / HF) on the SAME dummy weights must stay ≥ 0.9999 (set-match for top-k ops). The first layer/op below threshold localizes a break — do not proceed until it passes.</w:t>
       </w:r>
     </w:p>
     <w:p>
@@ -546,7 +546,7 @@
           <w:color w:val="555555"/>
           <w:sz w:val="21"/>
         </w:rPr>
-        <w:t>Perf runs use DUMMY weights (no real load) AND a depth-reduced proxy: every DSv4 layer is the identical MoE+MLA+DSA archetype (first_k_dense_replace=0, moe_layer_freq=1), so end-to-end wall time is LINEAR in depth, t(L) = t_fixed + L·t_layer. This keeps every iteration cheap (4 layers, not 43) while still reporting a full-depth number.</w:t>
+        <w:t>Perf runs use DUMMY weights (no real load) AND a depth-reduced proxy. When the layer stack is a repeated archetype (homogeneous transformer — the common case), end-to-end wall time is LINEAR in depth, t(L) = t_fixed + L·t_layer, so a few-layer proxy is representative (pilot: 4 layers vs the full N). For HETEROGENEOUS stacks, include each distinct archetype at least once and scale per-archetype.</w:t>
       </w:r>
     </w:p>
     <w:p>
@@ -555,7 +555,7 @@
         <w:spacing w:after="40"/>
       </w:pPr>
       <w:r>
-        <w:t>Calibrate ONCE at baseline from two proxy depths (4 and 8 layers): t_layer = (t₈ − t₄)/4 and t_fixed = t₄ − 4·t_layer, where t_fixed is the non-layer cost (embed + lm_head + framework/sampling).</w:t>
+        <w:t>Calibrate ONCE at baseline from two proxy depths p and q: t_layer = (t_q − t_p)/(q − p) and t_fixed = t_p − p·t_layer, where t_fixed is the non-layer cost (embed + output head + framework/sampling). (pilot p=4, q=8.)</w:t>
       </w:r>
     </w:p>
     <w:p>
@@ -564,7 +564,7 @@
         <w:spacing w:after="40"/>
       </w:pPr>
       <w:r>
-        <w:t>Each iteration records BOTH: (a) the MEASURED proxy-4 wall time, and (b) the full-depth wall time derived ANALYTICALLY — t_layer(iter) = (t_proxy4(iter) − t_fixed)/4, predicted full = t_fixed + 43·t_layer(iter). Report proxy and full-scaled speed-up curves side by side (they differ because the fixed overhead does not scale).</w:t>
+        <w:t>Each iteration records BOTH: (a) the MEASURED proxy wall time, and (b) the full-depth wall time derived ANALYTICALLY — t_layer(iter) = (t_proxy(iter) − t_fixed)/p, predicted full = t_fixed + N·t_layer(iter). Report proxy and full-scaled speed-up curves side by side (they differ because the fixed overhead does not scale).</w:t>
       </w:r>
     </w:p>
     <w:p>
@@ -573,7 +573,7 @@
         <w:spacing w:after="40"/>
       </w:pPr>
       <w:r>
-        <w:t>t_fixed is config-invariant across per-layer optimizations; recalibrate only if a NON-layer op (e.g. lm_head) is optimized.</w:t>
+        <w:t>t_fixed is config-invariant across per-layer optimizations; recalibrate only if a NON-layer op (e.g. the output head) is optimized.</w:t>
       </w:r>
     </w:p>
     <w:p>
@@ -582,7 +582,7 @@
         <w:spacing w:after="40"/>
       </w:pPr>
       <w:r>
-        <w:t>END VALIDATION: after all ops are integrated, do ONE full-depth dummy run (43 layers) and compare the MEASURED full-depth wall time against the analytically predicted value — small error confirms the whole depth-scaled progression. Ledger: plugin/validate/results/wall_time_progress.json.</w:t>
+        <w:t>END VALIDATION: after all ops are integrated, do ONE full-depth dummy run (all N layers) and compare the MEASURED full-depth wall time against the analytically predicted value — small error confirms the whole depth-scaled progression.</w:t>
       </w:r>
     </w:p>
     <w:p>
@@ -693,7 +693,7 @@
           <w:color w:val="555555"/>
           <w:sz w:val="21"/>
         </w:rPr>
-        <w:t>The dummy-weight run must exercise a REPRESENTATIVE set of routed experts. With tiny random gate weights, a non-diverse input (e.g. one hidden vector broadcast across the batch) collapses routing to the same top-k experts every token — only ~topk of the E=256 experts run, so the measured MoE wall time is unrepresentatively low and the roofline's expert traffic is never incurred.</w:t>
+        <w:t>The dummy-weight run must exercise a REPRESENTATIVE set of routed experts. With tiny random gate weights, a non-diverse input (e.g. one hidden vector broadcast across the batch) collapses routing to the same top-k experts every token — only ~topk of the E experts run, so the measured MoE wall time is unrepresentatively low and the roofline's expert traffic is never incurred.</w:t>
       </w:r>
     </w:p>
     <w:p>
@@ -711,7 +711,7 @@
         <w:spacing w:after="40"/>
       </w:pPr>
       <w:r>
-        <w:t>VERIFY (not assume) dispersion: realized distinct-experts must track the uniform expectation E·(1−(1−1/E)^(topk·M)) and no expert may absorb an outsized share — a collapse gate asserts this before the timing is trusted. (Checked M=8→43, 16→81, 32→138, 64→209 distinct vs expected 43.8/80.2/135.3/199; the broadcast trap collapses to 6 and is rejected.)</w:t>
+        <w:t>VERIFY (not assume) dispersion: realized distinct-experts must track the uniform expectation E·(1−(1−1/E)^(topk·M)) and no expert may absorb an outsized share — a collapse gate asserts this before the timing is trusted. (pilot E=256: checked M=8→43, 16→81, 32→138, 64→209 distinct vs expected 43.8/80.2/135.3/199; the broadcast trap collapses to 6 and is rejected.)</w:t>
       </w:r>
     </w:p>
     <w:p>
@@ -741,7 +741,7 @@
         <w:spacing w:after="40"/>
       </w:pPr>
       <w:r>
-        <w:t>Validate-by-run (Gate 2): confirm the predicted class/ceiling in-engine (dummy weights for perf, full depth, target ISA). Mismatch → the paper model omitted a cost; update it.</w:t>
+        <w:t>Validate-by-run: confirm the predicted class/ceiling in-engine (dummy weights for perf, full depth, target backend). Mismatch → the paper model omitted a cost; update it.</w:t>
       </w:r>
     </w:p>
     <w:p>
@@ -750,7 +750,7 @@
         <w:spacing w:after="40"/>
       </w:pPr>
       <w:r>
-        <w:t>Accuracy oracle finale: real-weight per-token parity vs HF → task accuracy (gsm8k) → GPU-vs-CPU cross-check sign-off.</w:t>
+        <w:t>Accuracy finale: real-weight per-token parity vs a trusted reference → task accuracy (e.g. gsm8k) → reference-vs-target cross-check sign-off.</w:t>
       </w:r>
     </w:p>
     <w:p>
@@ -759,7 +759,7 @@
         <w:spacing w:after="40"/>
       </w:pPr>
       <w:r>
-        <w:t>Enablement certificate (op→kernel→donor provenance + parity gates); peer-relative roofline (efficiency vs a shipped donor ≥ 0.90); ship as plugin override (no fork).</w:t>
+        <w:t>Provenance record (op→kernel→donor + parity gates) and a peer-relative check where an already-shipped model shares the same kernels (efficiency within tolerance); ship as a plugin override (no fork).</w:t>
       </w:r>
     </w:p>
     <w:p>
@@ -780,7 +780,7 @@
         <w:spacing w:after="40"/>
       </w:pPr>
       <w:r>
-        <w:t>Deterministic-dummy weights: (a) skip the real checkpoint load for fast perf iteration; (b) make CPU dummy bit-identical to the GPU/torch dummy reference so a per-layer diff is valid without real weights.</w:t>
+        <w:t>Deterministic-dummy weights: (a) skip the real checkpoint load for fast perf iteration; (b) make the target dummy bit-identical to the reference dummy so a per-layer diff is valid without real weights.</w:t>
       </w:r>
     </w:p>
     <w:p>
@@ -789,7 +789,7 @@
         <w:spacing w:after="40"/>
       </w:pPr>
       <w:r>
-        <w:t>Layer-by-layer cosine fingerprint: capture a per-layer reference, run CPU with the same dummy weights, diff per-layer hidden states by cosine similarity; the first layer below ~0.999 localizes the break.</w:t>
+        <w:t>Layer-by-layer cosine fingerprint: capture a per-layer reference, run the target with the same dummy weights, diff per-layer hidden states by cosine similarity; the first layer below ~0.999 localizes the break.</w:t>
       </w:r>
     </w:p>
     <w:p>
@@ -807,7 +807,7 @@
         <w:spacing w:after="40"/>
       </w:pPr>
       <w:r>
-        <w:t>Isolation switches to bisect novel ops (ignore DSA selection → dense, force-dense MoE, swap kernel ↔ torch reference).</w:t>
+        <w:t>Isolation switches to bisect novel ops (e.g. bypass sparse selection → dense, force-dense MoE, swap kernel ↔ reference).</w:t>
       </w:r>
     </w:p>
     <w:p>
@@ -816,7 +816,7 @@
         <w:spacing w:after="40"/>
       </w:pPr>
       <w:r>
-        <w:t>Reduces-to-identity checks (sparse attend → exact dense at top-k=all) and low-bit dtype-bridge parity vs an independent torch dequant oracle.</w:t>
+        <w:t>Reduces-to-identity checks (e.g. sparse attend → exact dense at top-k=all) and low-bit dtype-bridge parity vs an independent dequant oracle.</w:t>
       </w:r>
     </w:p>
     <w:p>
@@ -825,7 +825,7 @@
         <w:spacing w:after="40"/>
       </w:pPr>
       <w:r>
-        <w:t>Escalation order: L0 coherence → per-layer cosine (dummy, no load) → per-op fingerprint + isolation → component/reduces-to-identity parity → real-weight per-token parity → task accuracy → GPU-vs-CPU sign-off.</w:t>
+        <w:t>Escalation order: L0 coherence → per-layer cosine (dummy, no load) → per-op fingerprint + isolation → component/reduces-to-identity parity → real-weight per-token parity → task accuracy → reference-vs-target sign-off.</w:t>
       </w:r>
     </w:p>
     <w:p>
@@ -864,7 +864,7 @@
         <w:spacing w:after="40"/>
       </w:pPr>
       <w:r>
-        <w:t>Fusion roofline gate (bytes saved + AI lift + L2-resident; GPU oracle where available)</w:t>
+        <w:t>Fusion roofline gate (bytes saved + AI lift + cache-resident; reference oracle where available)</w:t>
       </w:r>
     </w:p>
     <w:p>
@@ -900,7 +900,7 @@
         <w:spacing w:after="40"/>
       </w:pPr>
       <w:r>
-        <w:t>Accuracy-oracle gate · Human-gate (novel kernels)</w:t>
+        <w:t>Accuracy gate · Human-gate (novel kernels)</w:t>
       </w:r>
     </w:p>
     <w:p>
@@ -912,7 +912,20 @@
           <w:color w:val="1F3764"/>
           <w:sz w:val="30"/>
         </w:rPr>
-        <w:t>Pilot platform — EMR (measured)</w:t>
+        <w:t>Platform card — an INPUT, filled per target by the probe</w:t>
+      </w:r>
+    </w:p>
+    <w:p>
+      <w:pPr>
+        <w:spacing w:after="80"/>
+      </w:pPr>
+      <w:r>
+        <w:rPr>
+          <w:b w:val="0"/>
+          <w:color w:val="555555"/>
+          <w:sz w:val="21"/>
+        </w:rPr>
+        <w:t>The method assumes NO specific values. Below is the pilot's instantiation (produced by the uArch probe); retarget by swapping the per-platform spec file. Every number here is measured, not assumed.</w:t>
       </w:r>
     </w:p>
     <w:tbl>
@@ -935,7 +948,7 @@
               <w:rPr>
                 <w:b/>
               </w:rPr>
-              <w:t>Property</w:t>
+              <w:t>Property (pilot example)</w:t>
             </w:r>
           </w:p>
         </w:tc>
@@ -948,7 +961,7 @@
               <w:rPr>
                 <w:b/>
               </w:rPr>
-              <w:t>Value (measured 2026-10-07, pcl-spr10)</w:t>
+              <w:t>Value (DeepSeek-V4-Flash on Intel Xeon EMR, measured 2026-10-07)</w:t>
             </w:r>
           </w:p>
         </w:tc>
@@ -1139,7 +1152,7 @@
           <w:color w:val="1F3764"/>
           <w:sz w:val="30"/>
         </w:rPr>
-        <w:t>Note — divergence from the published tree</w:t>
+        <w:t>Method note — all-ops-to-ceiling before wall-time ordering</w:t>
       </w:r>
     </w:p>
     <w:p>
@@ -1152,7 +1165,7 @@
           <w:color w:val="555555"/>
           <w:sz w:val="21"/>
         </w:rPr>
-        <w:t>The codified tree ROI-skips low-share ops (“dominant kernel at roofline”). This pilot requires all ops at their ceiling (Phase A) before wall-time/Amdahl ordering (Phase B). This is reported to the tree owner as a methodology item; the pilot does not edit the tree.</w:t>
+        <w:t>This playbook requires EVERY op at its roofline ceiling (Phase A) BEFORE wall-time / Amdahl ordering (Phase B), rather than ROI-skipping low-share ops up front. The inversion is deliberate: a cheap op can hide a systemic pathology, and completeness-first makes the Phase-B wall-time attribution trustworthy. Applies unchanged across models and platforms.</w:t>
       </w:r>
     </w:p>
     <w:sectPr>

</xml_diff>

<commit_message>
pilot: per-op pass ledger (before/after every pass, best-vs-roofline) seeded op1/op2; encode parallel-authoring/serial-integration in playbook
</commit_message>
<xml_diff>
--- a/docs/dsv4_pilot_playbook.docx
+++ b/docs/dsv4_pilot_playbook.docx
@@ -430,6 +430,49 @@
           <w:sz w:val="21"/>
         </w:rPr>
         <w:t>Ledger artifact: plugin/validate/results/wall_time_progress.json (baseline row + one row per op, filled after each integration).</w:t>
+      </w:r>
+    </w:p>
+    <w:p>
+      <w:pPr>
+        <w:pStyle w:val="Heading2"/>
+      </w:pPr>
+      <w:r>
+        <w:rPr>
+          <w:color w:val="2E5BA8"/>
+          <w:sz w:val="24"/>
+        </w:rPr>
+        <w:t>Parallel authoring, serial integration, per-pass record</w:t>
+      </w:r>
+    </w:p>
+    <w:p>
+      <w:pPr>
+        <w:spacing w:after="80"/>
+      </w:pPr>
+      <w:r>
+        <w:rPr>
+          <w:b w:val="0"/>
+          <w:color w:val="555555"/>
+          <w:sz w:val="21"/>
+        </w:rPr>
+        <w:t>Ops are independent work items (distinct kernel, distinct microbench), so AUTHOR THEM IN PARALLEL (one op per idle node) and QUEUE the finished best-of versions. INTEGRATION stays serial: dequeue one op at a time, cosine-gate, re-run the wall-time ledger. Only the integrated re-profile is serial.</w:t>
+      </w:r>
+    </w:p>
+    <w:p>
+      <w:pPr>
+        <w:pStyle w:val="ListBullet"/>
+        <w:spacing w:after="40"/>
+      </w:pPr>
+      <w:r>
+        <w:t>Per op, record EVERY optimization pass (before/after): approach, off-machine-peak and vs-reference per M, correctness (cosine / set-match), kept?, commit. The final KEPT pass is the best-of, reported against the roofline (at-ceiling, or surfaced-as-plateaued with the residual-gap cause).</w:t>
+      </w:r>
+    </w:p>
+    <w:p>
+      <w:pPr>
+        <w:pStyle w:val="ListBullet"/>
+        <w:spacing w:after="40"/>
+      </w:pPr>
+      <w:r>
+        <w:t>Per-op pass ledgers: plugin/validate/results/op_passes/&lt;op&gt;.json (schema in _schema.json).</w:t>
       </w:r>
     </w:p>
     <w:p>

</xml_diff>

<commit_message>
pilot: torch-fallback registry (op2 M=8 torch.topk at limit, locked) + surface-at-phase-end rule in playbook
</commit_message>
<xml_diff>
--- a/docs/dsv4_pilot_playbook.docx
+++ b/docs/dsv4_pilot_playbook.docx
@@ -473,6 +473,15 @@
       </w:pPr>
       <w:r>
         <w:t>Per-op pass ledgers: plugin/validate/results/op_passes/&lt;op&gt;.json (schema in _schema.json).</w:t>
+      </w:r>
+    </w:p>
+    <w:p>
+      <w:pPr>
+        <w:pStyle w:val="ListBullet"/>
+        <w:spacing w:after="40"/>
+      </w:pPr>
+      <w:r>
+        <w:t>Torch/donor fallback registry: every point where the kept best-of falls back to torch (or a donor) instead of the custom path is recorded with its reason + limit justification (plugin/validate/results/torch_fallbacks.json). A fallback is legitimate only if strictly best-of (no regression at that point) OR at the measured limit with no lever left. The WHOLE registry is SURFACED FOR REVIEW at the end of the optimization + integration phase.</w:t>
       </w:r>
     </w:p>
     <w:p>

</xml_diff>

<commit_message>
pilot: author ops #3 compressor / #4 sparse-attend / #5 sinkhorn (fresh C++, reference-first) + microbenches + parallel launcher; surfaced_limits registry (op1 limit); playbook proxy principle
</commit_message>
<xml_diff>
--- a/docs/dsv4_pilot_playbook.docx
+++ b/docs/dsv4_pilot_playbook.docx
@@ -417,6 +417,19 @@
           <w:sz w:val="21"/>
         </w:rPr>
         <w:t>Each optimization is proven end-to-end, not just in a microbench. We keep a running wall-time ledger from the unoptimized baseline through every integrated op, so the final publication shows a monotonic, correctness-gated speed-up curve.</w:t>
+      </w:r>
+    </w:p>
+    <w:p>
+      <w:pPr>
+        <w:spacing w:after="80"/>
+      </w:pPr>
+      <w:r>
+        <w:rPr>
+          <w:b w:val="0"/>
+          <w:color w:val="555555"/>
+          <w:sz w:val="21"/>
+        </w:rPr>
+        <w:t>Use the CHEAPEST representative proxy at every altitude, wherever feasible, and recover the full-scale number ANALYTICALLY — validated by ONE full run at the end: (a) op optimization uses the isolated-op microbench at real op dims (and reduced context S where the op scales trivially in S); (b) wall-time uses the depth-reduced model with linear depth-scaling to full N. Proxies move us faster; the single full-depth run at phase end confirms the analytical scaling held.</w:t>
       </w:r>
     </w:p>
     <w:p>

</xml_diff>

<commit_message>
playbook: add deliverable contract (author C/C++ -> test -> integrate into SGLang/torch -> E2E via sgl.Engine)
</commit_message>
<xml_diff>
--- a/docs/dsv4_pilot_playbook.docx
+++ b/docs/dsv4_pilot_playbook.docx
@@ -119,6 +119,66 @@
           <w:sz w:val="21"/>
         </w:rPr>
         <w:t>Scope discovery is the router (which ops are covered vs novel); the spine-leaf performance tree — the macro/meso/micro per-op roofline loop — is the engine. One pipeline, re-applied per (model, platform).</w:t>
+      </w:r>
+    </w:p>
+    <w:p>
+      <w:pPr>
+        <w:spacing w:after="80"/>
+      </w:pPr>
+      <w:r>
+        <w:rPr>
+          <w:b/>
+          <w:sz w:val="21"/>
+        </w:rPr>
+        <w:t>Deliverable contract (what the pipeline guarantees):</w:t>
+      </w:r>
+    </w:p>
+    <w:p>
+      <w:pPr>
+        <w:pStyle w:val="ListBullet"/>
+        <w:spacing w:after="40"/>
+      </w:pPr>
+      <w:r>
+        <w:rPr>
+          <w:b/>
+          <w:color w:val="1F3764"/>
+        </w:rPr>
+        <w:t xml:space="preserve">1 — </w:t>
+      </w:r>
+      <w:r>
+        <w:t>Every op / fused-op is AUTHORED as a native kernel — a C/C++ torch extension on CPU (CUDA/Triton on GPU). Nothing hot stays in eager python/torch.</w:t>
+      </w:r>
+    </w:p>
+    <w:p>
+      <w:pPr>
+        <w:pStyle w:val="ListBullet"/>
+        <w:spacing w:after="40"/>
+      </w:pPr>
+      <w:r>
+        <w:rPr>
+          <w:b/>
+          <w:color w:val="1F3764"/>
+        </w:rPr>
+        <w:t xml:space="preserve">2 — </w:t>
+      </w:r>
+      <w:r>
+        <w:t>Each authored kernel is TESTED standalone (parity + roofline) and ONLY THEN integrated into the serving stack's model behind the cosine-fingerprint gate — wired as a torch op, no fork (the pilot: SGLang external model package / PyTorch).</w:t>
+      </w:r>
+    </w:p>
+    <w:p>
+      <w:pPr>
+        <w:pStyle w:val="ListBullet"/>
+        <w:spacing w:after="40"/>
+      </w:pPr>
+      <w:r>
+        <w:rPr>
+          <w:b/>
+          <w:color w:val="1F3764"/>
+        </w:rPr>
+        <w:t xml:space="preserve">3 — </w:t>
+      </w:r>
+      <w:r>
+        <w:t>All end-to-end model runs execute through the serving-stack engine (the pilot: SGLang / sgl.Engine), not a bespoke loop — so wall-time reflects the real inference path.</w:t>
       </w:r>
     </w:p>
     <w:p>

</xml_diff>

<commit_message>
playbook: add Shape-capture audit (reality-grounded, human-auditable) + shape-provenance gate; flag op3/op4 perf as shape-UNVERIFIED (config-inferred, not captured)
</commit_message>
<xml_diff>
--- a/docs/dsv4_pilot_playbook.docx
+++ b/docs/dsv4_pilot_playbook.docx
@@ -962,6 +962,110 @@
           <w:color w:val="1F3764"/>
           <w:sz w:val="30"/>
         </w:rPr>
+        <w:t>Shape-capture audit — ground every kernel's shapes in REALITY (human-auditable)</w:t>
+      </w:r>
+    </w:p>
+    <w:p>
+      <w:pPr>
+        <w:spacing w:after="80"/>
+      </w:pPr>
+      <w:r>
+        <w:rPr>
+          <w:b/>
+          <w:sz w:val="21"/>
+        </w:rPr>
+        <w:t>A green parity microbench is SELF-CONSISTENT: it validates op MATH at the shapes the author CHOSE, so a wrong-but-consistent or hallucinated shape still passes (softmax-pool, flash-attention etc. are shape-generic). Op tensor/GEMM shapes must therefore be grounded in the REAL model — not hand-picked, and not merely inferred from the config.</w:t>
+      </w:r>
+    </w:p>
+    <w:p>
+      <w:pPr>
+        <w:spacing w:after="80"/>
+      </w:pPr>
+      <w:r>
+        <w:rPr>
+          <w:b w:val="0"/>
+          <w:color w:val="555555"/>
+          <w:sz w:val="21"/>
+        </w:rPr>
+        <w:t>Provenance ladder (trust increases down; a kernel is trusted only at the bottom rung):</w:t>
+      </w:r>
+    </w:p>
+    <w:p>
+      <w:pPr>
+        <w:pStyle w:val="ListBullet"/>
+        <w:spacing w:after="40"/>
+      </w:pPr>
+      <w:r>
+        <w:t>hand-picked microbench shapes — REJECT as evidence (self-consistent only).</w:t>
+      </w:r>
+    </w:p>
+    <w:p>
+      <w:pPr>
+        <w:pStyle w:val="ListBullet"/>
+        <w:spacing w:after="40"/>
+      </w:pPr>
+      <w:r>
+        <w:t>config-spec dims — weak (a declared config can be wrong or regenerated).</w:t>
+      </w:r>
+    </w:p>
+    <w:p>
+      <w:pPr>
+        <w:pStyle w:val="ListBullet"/>
+        <w:spacing w:after="40"/>
+      </w:pPr>
+      <w:r>
+        <w:t>module-constructor-derived dims — better (the model computes op dims from config deterministically).</w:t>
+      </w:r>
+    </w:p>
+    <w:p>
+      <w:pPr>
+        <w:pStyle w:val="ListBullet"/>
+        <w:spacing w:after="40"/>
+      </w:pPr>
+      <w:r>
+        <w:t>CAPTURED tensors from a real forward (dummy weights OK) — REQUIRED: dump {op, tensor, shape, dtype, stride, layer_id} at every op boundary and DRIVE the microbench from these.</w:t>
+      </w:r>
+    </w:p>
+    <w:p>
+      <w:pPr>
+        <w:pStyle w:val="ListBullet"/>
+        <w:spacing w:after="40"/>
+      </w:pPr>
+      <w:r>
+        <w:t>Kernel shape-contract asserts (check each dim vs the captured/expected value) so a wrong shape fails loudly, not silently.</w:t>
+      </w:r>
+    </w:p>
+    <w:p>
+      <w:pPr>
+        <w:pStyle w:val="ListBullet"/>
+        <w:spacing w:after="40"/>
+      </w:pPr>
+      <w:r>
+        <w:t>Emit a reviewable SHAPE MANIFEST (per-op captured shapes + their source) that a HUMAN signs off before the kernel is trusted — the manifest + op-math-vs-reference together are the human-audit gate.</w:t>
+      </w:r>
+    </w:p>
+    <w:p>
+      <w:pPr>
+        <w:spacing w:after="80"/>
+      </w:pPr>
+      <w:r>
+        <w:rPr>
+          <w:b w:val="0"/>
+          <w:color w:val="555555"/>
+          <w:sz w:val="21"/>
+        </w:rPr>
+        <w:t>Consequence: performance numbers measured at non-captured shapes are NOT trustworthy — an attention kernel at the wrong head_dim/head_count can flip which variant wins. Re-measure at captured shapes. Never re-GUESS a shape after finding one wrong (same failure mode) — CAPTURE it.</w:t>
+      </w:r>
+    </w:p>
+    <w:p>
+      <w:pPr>
+        <w:pStyle w:val="Heading1"/>
+      </w:pPr>
+      <w:r>
+        <w:rPr>
+          <w:color w:val="1F3764"/>
+          <w:sz w:val="30"/>
+        </w:rPr>
         <w:t>Gates</w:t>
       </w:r>
     </w:p>
@@ -990,6 +1094,15 @@
       </w:pPr>
       <w:r>
         <w:t>Fusion roofline gate (bytes saved + AI lift + cache-resident; reference oracle where available)</w:t>
+      </w:r>
+    </w:p>
+    <w:p>
+      <w:pPr>
+        <w:pStyle w:val="ListBullet"/>
+        <w:spacing w:after="40"/>
+      </w:pPr>
+      <w:r>
+        <w:t>Shape-provenance gate (every kernel's shapes CAPTURED from the real forward + human-signed manifest, before trust/perf-claims)</w:t>
       </w:r>
     </w:p>
     <w:p>

</xml_diff>

<commit_message>
shape-provenance: encode published-reference-model method in playbook; fix roofline dims (indexer wq 1024->8192, weights_proj 4096->64, wo_b 8192->4096); re-author op4 sparse-attend (MQA+sink, H=64/D=512) + op3/op4 benches at real dims
</commit_message>
<xml_diff>
--- a/docs/dsv4_pilot_playbook.docx
+++ b/docs/dsv4_pilot_playbook.docx
@@ -962,7 +962,7 @@
           <w:color w:val="1F3764"/>
           <w:sz w:val="30"/>
         </w:rPr>
-        <w:t>Shape-capture audit — ground every kernel's shapes in REALITY (human-auditable)</w:t>
+        <w:t>Shape &amp; semantics provenance — ground kernels in the PUBLISHED reference (human-auditable)</w:t>
       </w:r>
     </w:p>
     <w:p>
@@ -974,7 +974,115 @@
           <w:b/>
           <w:sz w:val="21"/>
         </w:rPr>
-        <w:t>A green parity microbench is SELF-CONSISTENT: it validates op MATH at the shapes the author CHOSE, so a wrong-but-consistent or hallucinated shape still passes (softmax-pool, flash-attention etc. are shape-generic). Op tensor/GEMM shapes must therefore be grounded in the REAL model — not hand-picked, and not merely inferred from the config.</w:t>
+        <w:t>A green parity microbench is SELF-CONSISTENT only: it validates op MATH at shapes the AUTHOR chose. Shape-generic ops (softmax-pool, flash-attention) pass cos=1.0 at ANY dims, so a hallucinated shape OR a missing semantic (an overlap window, an attention sink, MQA-vs-MHA) still passes. Ground every kernel's shapes AND semantics in the model author's PUBLISHED reference, not in author-chosen shapes and not in inference from the config alone.</w:t>
+      </w:r>
+    </w:p>
+    <w:p>
+      <w:pPr>
+        <w:pStyle w:val="Heading2"/>
+      </w:pPr>
+      <w:r>
+        <w:rPr>
+          <w:color w:val="2E5BA8"/>
+          <w:sz w:val="24"/>
+        </w:rPr>
+        <w:t>The method (model-agnostic, in order)</w:t>
+      </w:r>
+    </w:p>
+    <w:p>
+      <w:pPr>
+        <w:pStyle w:val="ListNumber"/>
+        <w:spacing w:after="40"/>
+      </w:pPr>
+      <w:r>
+        <w:rPr>
+          <w:b/>
+          <w:color w:val="1F3764"/>
+        </w:rPr>
+        <w:t xml:space="preserve">1 — </w:t>
+      </w:r>
+      <w:r>
+        <w:t>PIN the published reference model definition (the author's own model.py / modeling_*.py) at a fixed revision. This is the architecture a human reviewer already trusts — the audit anchor.</w:t>
+      </w:r>
+    </w:p>
+    <w:p>
+      <w:pPr>
+        <w:pStyle w:val="ListNumber"/>
+        <w:spacing w:after="40"/>
+      </w:pPr>
+      <w:r>
+        <w:rPr>
+          <w:b/>
+          <w:color w:val="1F3764"/>
+        </w:rPr>
+        <w:t xml:space="preserve">2 — </w:t>
+      </w:r>
+      <w:r>
+        <w:t>Derive, per op, a CONTRACT from it: shapes as f(config, per-layer variant, phase, TP, batch) AND the SEMANTICS (fusions, gating, sinks, overlap windows, MQA/MHA, two-of-a-kind modules). Cite the source line.</w:t>
+      </w:r>
+    </w:p>
+    <w:p>
+      <w:pPr>
+        <w:pStyle w:val="ListNumber"/>
+        <w:spacing w:after="40"/>
+      </w:pPr>
+      <w:r>
+        <w:rPr>
+          <w:b/>
+          <w:color w:val="1F3764"/>
+        </w:rPr>
+        <w:t xml:space="preserve">3 — </w:t>
+      </w:r>
+      <w:r>
+        <w:t>BIND numeric constants from the real checkpoint config.json — the reference's defaults are often a TOY example (e.g. fewer layers/experts). CROSS-CHECK config vs reference defaults and reconcile any divergence; this also audits a regenerated/proxy config.</w:t>
+      </w:r>
+    </w:p>
+    <w:p>
+      <w:pPr>
+        <w:pStyle w:val="ListNumber"/>
+        <w:spacing w:after="40"/>
+      </w:pPr>
+      <w:r>
+        <w:rPr>
+          <w:b/>
+          <w:color w:val="1F3764"/>
+        </w:rPr>
+        <w:t xml:space="preserve">4 — </w:t>
+      </w:r>
+      <w:r>
+        <w:t>SWEEP the contract over the REAL variation axes — per-layer variants (e.g. per-layer compression ratios), prefill vs decode, TP, batch M — and assert each shape is VALID and EQUALS the kernel's contract (equality, not mere internal validity).</w:t>
+      </w:r>
+    </w:p>
+    <w:p>
+      <w:pPr>
+        <w:pStyle w:val="ListNumber"/>
+        <w:spacing w:after="40"/>
+      </w:pPr>
+      <w:r>
+        <w:rPr>
+          <w:b/>
+          <w:color w:val="1F3764"/>
+        </w:rPr>
+        <w:t xml:space="preserve">5 — </w:t>
+      </w:r>
+      <w:r>
+        <w:t>Port the published forward as the NUMERICAL ORACLE (exact parity, not a re-derived reference) so a SEMANTIC error, not just a shape error, is caught.</w:t>
+      </w:r>
+    </w:p>
+    <w:p>
+      <w:pPr>
+        <w:pStyle w:val="ListNumber"/>
+        <w:spacing w:after="40"/>
+      </w:pPr>
+      <w:r>
+        <w:rPr>
+          <w:b/>
+          <w:color w:val="1F3764"/>
+        </w:rPr>
+        <w:t xml:space="preserve">6 — </w:t>
+      </w:r>
+      <w:r>
+        <w:t>RUNTIME-CAPTURE (module-level now, full-forward at integration) to CONFIRM the serving stack's actual layout matches the contract — the serving path may repack/absorb/shard differently from the reference.</w:t>
       </w:r>
     </w:p>
     <w:p>
@@ -987,61 +1095,7 @@
           <w:color w:val="555555"/>
           <w:sz w:val="21"/>
         </w:rPr>
-        <w:t>Provenance ladder (trust increases down; a kernel is trusted only at the bottom rung):</w:t>
-      </w:r>
-    </w:p>
-    <w:p>
-      <w:pPr>
-        <w:pStyle w:val="ListBullet"/>
-        <w:spacing w:after="40"/>
-      </w:pPr>
-      <w:r>
-        <w:t>hand-picked microbench shapes — REJECT as evidence (self-consistent only).</w:t>
-      </w:r>
-    </w:p>
-    <w:p>
-      <w:pPr>
-        <w:pStyle w:val="ListBullet"/>
-        <w:spacing w:after="40"/>
-      </w:pPr>
-      <w:r>
-        <w:t>config-spec dims — weak (a declared config can be wrong or regenerated).</w:t>
-      </w:r>
-    </w:p>
-    <w:p>
-      <w:pPr>
-        <w:pStyle w:val="ListBullet"/>
-        <w:spacing w:after="40"/>
-      </w:pPr>
-      <w:r>
-        <w:t>module-constructor-derived dims — better (the model computes op dims from config deterministically).</w:t>
-      </w:r>
-    </w:p>
-    <w:p>
-      <w:pPr>
-        <w:pStyle w:val="ListBullet"/>
-        <w:spacing w:after="40"/>
-      </w:pPr>
-      <w:r>
-        <w:t>CAPTURED tensors from a real forward (dummy weights OK) — REQUIRED: dump {op, tensor, shape, dtype, stride, layer_id} at every op boundary and DRIVE the microbench from these.</w:t>
-      </w:r>
-    </w:p>
-    <w:p>
-      <w:pPr>
-        <w:pStyle w:val="ListBullet"/>
-        <w:spacing w:after="40"/>
-      </w:pPr>
-      <w:r>
-        <w:t>Kernel shape-contract asserts (check each dim vs the captured/expected value) so a wrong shape fails loudly, not silently.</w:t>
-      </w:r>
-    </w:p>
-    <w:p>
-      <w:pPr>
-        <w:pStyle w:val="ListBullet"/>
-        <w:spacing w:after="40"/>
-      </w:pPr>
-      <w:r>
-        <w:t>Emit a reviewable SHAPE MANIFEST (per-op captured shapes + their source) that a HUMAN signs off before the kernel is trusted — the manifest + op-math-vs-reference together are the human-audit gate.</w:t>
+        <w:t>Why it survives human audit: every shape and semantic traces to a line in the PUBLISHED model + the real config; the sweep, validity and equality checks are mechanical; the oracle gives exact numbers. The reviewer checks FACTS and CITATIONS, not the agent's reading.</w:t>
       </w:r>
     </w:p>
     <w:p>
@@ -1054,7 +1108,7 @@
           <w:color w:val="555555"/>
           <w:sz w:val="21"/>
         </w:rPr>
-        <w:t>Consequence: performance numbers measured at non-captured shapes are NOT trustworthy — an attention kernel at the wrong head_dim/head_count can flip which variant wins. Re-measure at captured shapes. Never re-GUESS a shape after finding one wrong (same failure mode) — CAPTURE it.</w:t>
+        <w:t>Anti-patterns (each is a silent-failure trap): trusting a parity microbench at author-chosen shapes; inferring dims from config alone (misses semantics — overlap, sink, MQA); treating the reference's toy defaults as the real constants; and the cardinal sin — RE-GUESSING a shape after finding one wrong instead of capturing it from the published model.</w:t>
       </w:r>
     </w:p>
     <w:p>

</xml_diff>

<commit_message>
playbook: add generic Roofline-accounting discipline + open-item disposition protocol + gate; roofline: MODEL hc_post/hc_head (was UNMODELED) + per-call/calls-per-step breakdown; results/roofline_open_items.json tracks every quantity (MODELED/MEASURED/EXPLICITLY-UNMODELED)
</commit_message>
<xml_diff>
--- a/docs/dsv4_pilot_playbook.docx
+++ b/docs/dsv4_pilot_playbook.docx
@@ -1120,6 +1120,154 @@
           <w:color w:val="1F3764"/>
           <w:sz w:val="30"/>
         </w:rPr>
+        <w:t>Roofline accounting discipline — an invariant-tested, self-consistent model</w:t>
+      </w:r>
+    </w:p>
+    <w:p>
+      <w:pPr>
+        <w:spacing w:after="80"/>
+      </w:pPr>
+      <w:r>
+        <w:rPr>
+          <w:b/>
+          <w:sz w:val="21"/>
+        </w:rPr>
+        <w:t>An analytical roofline is trustworthy only if its FLOP/byte accounting is internally consistent. These rules are model-agnostic and must be encoded as INVARIANT TESTS that GATE report generation — a model that fails an invariant is not published.</w:t>
+      </w:r>
+    </w:p>
+    <w:p>
+      <w:pPr>
+        <w:pStyle w:val="ListBullet"/>
+        <w:spacing w:after="40"/>
+      </w:pPr>
+      <w:r>
+        <w:t>ONE tensor inventory: capacity AND per-op cost derive from the SAME op list — never a second hardcoded capacity formula that can drift from the op dimensions.</w:t>
+      </w:r>
+    </w:p>
+    <w:p>
+      <w:pPr>
+        <w:pStyle w:val="ListBullet"/>
+        <w:spacing w:after="40"/>
+      </w:pPr>
+      <w:r>
+        <w:t>DECLARE the workload: independent requests vs shared-prefix, what is reused, dtype per tensor. An optimistic model is acceptable only if the assumption is stated.</w:t>
+      </w:r>
+    </w:p>
+    <w:p>
+      <w:pPr>
+        <w:pStyle w:val="ListBullet"/>
+        <w:spacing w:after="40"/>
+      </w:pPr>
+      <w:r>
+        <w:t>Independent-request state (KV, activations) scales with batch M; weights are read once per step (M-independent). TEST: independent-request bytes are linear in M.</w:t>
+      </w:r>
+    </w:p>
+    <w:p>
+      <w:pPr>
+        <w:pStyle w:val="ListBullet"/>
+        <w:spacing w:after="40"/>
+      </w:pPr>
+      <w:r>
+        <w:t>FUSION removes round-trips, not weights: a fused op counts ALL its matrices (a SwiGLU expert is three), and a flash/fused op carries NO intermediate-score DRAM. TEST both structurally.</w:t>
+      </w:r>
+    </w:p>
+    <w:p>
+      <w:pPr>
+        <w:pStyle w:val="ListBullet"/>
+        <w:spacing w:after="40"/>
+      </w:pPr>
+      <w:r>
+        <w:t>RIDGE crossing solves the REAL arithmetic intensity (weights + activations) and returns “no crossing” when AI saturates below the ridge — not a weight-only approximation.</w:t>
+      </w:r>
+    </w:p>
+    <w:p>
+      <w:pPr>
+        <w:pStyle w:val="ListBullet"/>
+        <w:spacing w:after="40"/>
+      </w:pPr>
+      <w:r>
+        <w:t>Per-layer INVOCATION counts come from the config (per-layer variants/phases), not a uniform ×num_layers. Verify against the model; print per-call cost, calls/step, and per-step cost.</w:t>
+      </w:r>
+    </w:p>
+    <w:p>
+      <w:pPr>
+        <w:pStyle w:val="ListBullet"/>
+        <w:spacing w:after="40"/>
+      </w:pPr>
+      <w:r>
+        <w:t>Include quantization metadata (scale/padding bytes) in traffic AND capacity; low-bit storage is not native low-bit compute.</w:t>
+      </w:r>
+    </w:p>
+    <w:p>
+      <w:pPr>
+        <w:pStyle w:val="ListBullet"/>
+        <w:spacing w:after="40"/>
+      </w:pPr>
+      <w:r>
+        <w:t>Latency rows are MEASURED, justified-analytical, or EXPLICITLY-UNMODELED — never invented floors; zero FLOPs/bytes does not establish latency as the binding resource.</w:t>
+      </w:r>
+    </w:p>
+    <w:p>
+      <w:pPr>
+        <w:pStyle w:val="ListBullet"/>
+        <w:spacing w:after="40"/>
+      </w:pPr>
+      <w:r>
+        <w:t>Record hardware-profile PROVENANCE (node, memory type, clock); never mix measurements across configurations. The ideal roofline is an optimization TARGET, not an achievability claim.</w:t>
+      </w:r>
+    </w:p>
+    <w:p>
+      <w:pPr>
+        <w:pStyle w:val="ListBullet"/>
+        <w:spacing w:after="40"/>
+      </w:pPr>
+      <w:r>
+        <w:t>Report latency and useful throughput as PRIMARY; track useful-vs-executed FLOPs/traffic separately; use distance-from-roof only DIAGNOSTICALLY (a fused kernel can be faster at LOWER achieved bandwidth). Emit a roofline-VS-measured join per authored op.</w:t>
+      </w:r>
+    </w:p>
+    <w:p>
+      <w:pPr>
+        <w:pStyle w:val="ListBullet"/>
+        <w:spacing w:after="40"/>
+      </w:pPr>
+      <w:r>
+        <w:t>PROCESS: read external reviews/commits that touch your area BEFORE building on them — a rebase is not a read.</w:t>
+      </w:r>
+    </w:p>
+    <w:p>
+      <w:pPr>
+        <w:pStyle w:val="Heading2"/>
+      </w:pPr>
+      <w:r>
+        <w:rPr>
+          <w:color w:val="2E5BA8"/>
+          <w:sz w:val="24"/>
+        </w:rPr>
+        <w:t>Open-item disposition (never silently approximate)</w:t>
+      </w:r>
+    </w:p>
+    <w:p>
+      <w:pPr>
+        <w:spacing w:after="80"/>
+      </w:pPr>
+      <w:r>
+        <w:rPr>
+          <w:b w:val="0"/>
+          <w:color w:val="555555"/>
+          <w:sz w:val="21"/>
+        </w:rPr>
+        <w:t>Every quantity in the model is exactly one of: MODELED (derived, cite the source line), MEASURED (microbench), or EXPLICITLY-UNMODELED (declared + tracked + surfaced at review with a reason and a plan). No silent placeholders or invented constants. Unmodeled items are listed in the review, never hidden inside a number. Prefer MODELED when the reference gives a formula; fall back to EXPLICITLY-UNMODELED only when it genuinely cannot be derived yet.</w:t>
+      </w:r>
+    </w:p>
+    <w:p>
+      <w:pPr>
+        <w:pStyle w:val="Heading1"/>
+      </w:pPr>
+      <w:r>
+        <w:rPr>
+          <w:color w:val="1F3764"/>
+          <w:sz w:val="30"/>
+        </w:rPr>
         <w:t>Gates</w:t>
       </w:r>
     </w:p>
@@ -1157,6 +1305,15 @@
       </w:pPr>
       <w:r>
         <w:t>Shape-provenance gate (every kernel's shapes CAPTURED from the real forward + human-signed manifest, before trust/perf-claims)</w:t>
+      </w:r>
+    </w:p>
+    <w:p>
+      <w:pPr>
+        <w:pStyle w:val="ListBullet"/>
+        <w:spacing w:after="40"/>
+      </w:pPr>
+      <w:r>
+        <w:t>Roofline-accounting gate (invariant self-test passes + one inventory + every quantity MODELED/MEASURED/EXPLICITLY-UNMODELED, before the report is published)</w:t>
       </w:r>
     </w:p>
     <w:p>

</xml_diff>